<commit_message>
removed address from resume
</commit_message>
<xml_diff>
--- a/bdepst-resume-2021.docx
+++ b/bdepst-resume-2021.docx
@@ -7,10 +7,6 @@
         <w:spacing w:after="0" w:line="259" w:lineRule="auto"/>
         <w:ind w:left="10" w:firstLine="0"/>
         <w:jc w:val="center"/>
-        <w:rPr>
-          <w:b/>
-          <w:bCs/>
-        </w:rPr>
       </w:pPr>
       <w:r>
         <w:rPr>
@@ -36,19 +32,6 @@
         </w:rPr>
         <w:t xml:space="preserve"> Epstein</w:t>
       </w:r>
-    </w:p>
-    <w:p>
-      <w:pPr>
-        <w:spacing w:after="0" w:line="259" w:lineRule="auto"/>
-        <w:ind w:left="15" w:firstLine="0"/>
-        <w:jc w:val="center"/>
-      </w:pPr>
-      <w:r>
-        <w:rPr>
-          <w:sz w:val="22"/>
-        </w:rPr>
-        <w:t>43 Portland Street, Edison, NJ 08820</w:t>
-      </w:r>
       <w:r>
         <w:t xml:space="preserve"> </w:t>
       </w:r>
@@ -59,12 +42,6 @@
         <w:ind w:left="17" w:firstLine="0"/>
         <w:jc w:val="center"/>
       </w:pPr>
-      <w:r>
-        <w:rPr>
-          <w:sz w:val="22"/>
-        </w:rPr>
-        <w:t xml:space="preserve">201-618-8423 | </w:t>
-      </w:r>
       <w:r>
         <w:rPr>
           <w:color w:val="0000FF"/>
@@ -336,16 +313,8 @@
           <w:numId w:val="1"/>
         </w:numPr>
         <w:spacing w:after="0"/>
-        <w:rPr>
-          <w:sz w:val="20"/>
-          <w:szCs w:val="21"/>
-        </w:rPr>
-      </w:pPr>
-      <w:r>
-        <w:rPr>
-          <w:sz w:val="20"/>
-          <w:szCs w:val="21"/>
-        </w:rPr>
+      </w:pPr>
+      <w:r>
         <w:t xml:space="preserve">Relevant Coursework: Computer Organization, Computer Security, Web Systems, Foundations of </w:t>
       </w:r>
     </w:p>
@@ -353,16 +322,8 @@
       <w:pPr>
         <w:spacing w:after="0"/>
         <w:ind w:left="720" w:firstLine="0"/>
-        <w:rPr>
-          <w:sz w:val="20"/>
-          <w:szCs w:val="21"/>
-        </w:rPr>
-      </w:pPr>
-      <w:r>
-        <w:rPr>
-          <w:sz w:val="20"/>
-          <w:szCs w:val="21"/>
-        </w:rPr>
+      </w:pPr>
+      <w:r>
         <w:t xml:space="preserve">Computer Science, Computer Vision, Software Engineering, Computer Game Design and Development, Machine Learning </w:t>
       </w:r>
     </w:p>
@@ -373,16 +334,8 @@
           <w:numId w:val="1"/>
         </w:numPr>
         <w:spacing w:after="0"/>
-        <w:rPr>
-          <w:sz w:val="20"/>
-          <w:szCs w:val="21"/>
-        </w:rPr>
-      </w:pPr>
-      <w:r>
-        <w:rPr>
-          <w:sz w:val="20"/>
-          <w:szCs w:val="21"/>
-        </w:rPr>
+      </w:pPr>
+      <w:r>
         <w:t xml:space="preserve">Dean’s Honor List: Fall 2017, Spring 2018, Fall 2018 and University Honors: Fall 2018, Winter 2020  </w:t>
       </w:r>
     </w:p>
@@ -393,16 +346,8 @@
           <w:numId w:val="1"/>
         </w:numPr>
         <w:spacing w:after="0"/>
-        <w:rPr>
-          <w:sz w:val="20"/>
-          <w:szCs w:val="21"/>
-        </w:rPr>
-      </w:pPr>
-      <w:r>
-        <w:rPr>
-          <w:sz w:val="20"/>
-          <w:szCs w:val="21"/>
-        </w:rPr>
+      </w:pPr>
+      <w:r>
         <w:t>Instructional Aide for Computer Game Design and Development: Fall 2021</w:t>
       </w:r>
     </w:p>
@@ -717,13 +662,7 @@
         <w:t xml:space="preserve">           </w:t>
       </w:r>
       <w:r>
-        <w:t xml:space="preserve">May 2020 </w:t>
-      </w:r>
-      <w:r>
-        <w:t>–</w:t>
-      </w:r>
-      <w:r>
-        <w:t xml:space="preserve"> Present</w:t>
+        <w:t>May 2020 – Present</w:t>
       </w:r>
     </w:p>
     <w:p>
@@ -738,45 +677,25 @@
       <w:r>
         <w:t xml:space="preserve">Acknowledgments: </w:t>
       </w:r>
-      <w:r>
-        <w:fldChar w:fldCharType="begin"/>
-      </w:r>
-      <w:r>
-        <w:instrText xml:space="preserve"> HYPERLINK "https://arxiv.org/abs/2109.04947" </w:instrText>
-      </w:r>
-      <w:r>
-        <w:fldChar w:fldCharType="separate"/>
-      </w:r>
-      <w:r>
-        <w:rPr>
-          <w:rStyle w:val="Hyperlink"/>
-        </w:rPr>
-        <w:t>1</w:t>
-      </w:r>
-      <w:r>
-        <w:fldChar w:fldCharType="end"/>
-      </w:r>
+      <w:hyperlink r:id="rId8" w:history="1">
+        <w:r>
+          <w:rPr>
+            <w:rStyle w:val="Hyperlink"/>
+          </w:rPr>
+          <w:t>1</w:t>
+        </w:r>
+      </w:hyperlink>
       <w:r>
         <w:t xml:space="preserve">, </w:t>
       </w:r>
-      <w:r>
-        <w:fldChar w:fldCharType="begin"/>
-      </w:r>
-      <w:r>
-        <w:instrText xml:space="preserve"> HYPERLINK "https://arxiv.org/abs/2109.04922" </w:instrText>
-      </w:r>
-      <w:r>
-        <w:fldChar w:fldCharType="separate"/>
-      </w:r>
-      <w:r>
-        <w:rPr>
-          <w:rStyle w:val="Hyperlink"/>
-        </w:rPr>
-        <w:t>2</w:t>
-      </w:r>
-      <w:r>
-        <w:fldChar w:fldCharType="end"/>
-      </w:r>
+      <w:hyperlink r:id="rId9" w:history="1">
+        <w:r>
+          <w:rPr>
+            <w:rStyle w:val="Hyperlink"/>
+          </w:rPr>
+          <w:t>2</w:t>
+        </w:r>
+      </w:hyperlink>
     </w:p>
     <w:p>
       <w:pPr>
@@ -848,7 +767,7 @@
         <w:spacing w:after="0" w:line="259" w:lineRule="auto"/>
         <w:ind w:left="14" w:firstLine="0"/>
       </w:pPr>
-      <w:hyperlink r:id="rId8" w:history="1">
+      <w:hyperlink r:id="rId10" w:history="1">
         <w:r>
           <w:rPr>
             <w:rStyle w:val="Hyperlink"/>

</xml_diff>

<commit_message>
added animania to resume
</commit_message>
<xml_diff>
--- a/bdepst-resume-2021.docx
+++ b/bdepst-resume-2021.docx
@@ -61,14 +61,12 @@
         <w:t xml:space="preserve">| </w:t>
       </w:r>
       <w:hyperlink r:id="rId5" w:history="1">
-        <w:proofErr w:type="spellStart"/>
         <w:r>
           <w:rPr>
             <w:rStyle w:val="Hyperlink"/>
           </w:rPr>
           <w:t>bribri.dev</w:t>
         </w:r>
-        <w:proofErr w:type="spellEnd"/>
       </w:hyperlink>
     </w:p>
     <w:p>
@@ -230,7 +228,6 @@
       <w:r>
         <w:t xml:space="preserve"> </w:t>
       </w:r>
-      <w:proofErr w:type="gramStart"/>
       <w:r>
         <w:tab/>
       </w:r>
@@ -239,9 +236,6 @@
       </w:r>
       <w:r>
         <w:tab/>
-      </w:r>
-      <w:proofErr w:type="gramEnd"/>
-      <w:r>
         <w:t xml:space="preserve">  </w:t>
       </w:r>
       <w:r>
@@ -313,8 +307,16 @@
           <w:numId w:val="1"/>
         </w:numPr>
         <w:spacing w:after="0"/>
-      </w:pPr>
-      <w:r>
+        <w:rPr>
+          <w:sz w:val="20"/>
+          <w:szCs w:val="21"/>
+        </w:rPr>
+      </w:pPr>
+      <w:r>
+        <w:rPr>
+          <w:sz w:val="20"/>
+          <w:szCs w:val="21"/>
+        </w:rPr>
         <w:t xml:space="preserve">Relevant Coursework: Computer Organization, Computer Security, Web Systems, Foundations of </w:t>
       </w:r>
     </w:p>
@@ -322,8 +324,16 @@
       <w:pPr>
         <w:spacing w:after="0"/>
         <w:ind w:left="720" w:firstLine="0"/>
-      </w:pPr>
-      <w:r>
+        <w:rPr>
+          <w:sz w:val="20"/>
+          <w:szCs w:val="21"/>
+        </w:rPr>
+      </w:pPr>
+      <w:r>
+        <w:rPr>
+          <w:sz w:val="20"/>
+          <w:szCs w:val="21"/>
+        </w:rPr>
         <w:t xml:space="preserve">Computer Science, Computer Vision, Software Engineering, Computer Game Design and Development, Machine Learning </w:t>
       </w:r>
     </w:p>
@@ -334,8 +344,16 @@
           <w:numId w:val="1"/>
         </w:numPr>
         <w:spacing w:after="0"/>
-      </w:pPr>
-      <w:r>
+        <w:rPr>
+          <w:sz w:val="20"/>
+          <w:szCs w:val="21"/>
+        </w:rPr>
+      </w:pPr>
+      <w:r>
+        <w:rPr>
+          <w:sz w:val="20"/>
+          <w:szCs w:val="21"/>
+        </w:rPr>
         <w:t xml:space="preserve">Dean’s Honor List: Fall 2017, Spring 2018, Fall 2018 and University Honors: Fall 2018, Winter 2020  </w:t>
       </w:r>
     </w:p>
@@ -346,9 +364,32 @@
           <w:numId w:val="1"/>
         </w:numPr>
         <w:spacing w:after="0"/>
-      </w:pPr>
-      <w:r>
+        <w:rPr>
+          <w:sz w:val="20"/>
+          <w:szCs w:val="21"/>
+        </w:rPr>
+      </w:pPr>
+      <w:r>
+        <w:rPr>
+          <w:sz w:val="20"/>
+          <w:szCs w:val="21"/>
+        </w:rPr>
         <w:t>Instructional Aide for Computer Game Design and Development: Fall 2021</w:t>
+      </w:r>
+    </w:p>
+    <w:p>
+      <w:pPr>
+        <w:numPr>
+          <w:ilvl w:val="0"/>
+          <w:numId w:val="1"/>
+        </w:numPr>
+        <w:spacing w:after="0"/>
+      </w:pPr>
+      <w:r>
+        <w:t>President of Animania: T</w:t>
+      </w:r>
+      <w:r>
+        <w:t>he Japanese Animation Film Society</w:t>
       </w:r>
     </w:p>
     <w:p>
@@ -487,21 +528,12 @@
         <w:spacing w:after="0"/>
         <w:ind w:left="0" w:firstLine="0"/>
       </w:pPr>
-      <w:proofErr w:type="spellStart"/>
       <w:r>
         <w:rPr>
           <w:b/>
           <w:bCs/>
         </w:rPr>
-        <w:t>WolverineSoft</w:t>
-      </w:r>
-      <w:proofErr w:type="spellEnd"/>
-      <w:r>
-        <w:rPr>
-          <w:b/>
-          <w:bCs/>
-        </w:rPr>
-        <w:t xml:space="preserve"> Studio </w:t>
+        <w:t xml:space="preserve">WolverineSoft Studio </w:t>
       </w:r>
       <w:r>
         <w:rPr>
@@ -796,15 +828,7 @@
         <w:spacing w:after="0"/>
       </w:pPr>
       <w:r>
-        <w:t>Implemented, with partner, Conditional Generative Adversarial Network (</w:t>
-      </w:r>
-      <w:proofErr w:type="spellStart"/>
-      <w:r>
-        <w:t>cGAN</w:t>
-      </w:r>
-      <w:proofErr w:type="spellEnd"/>
-      <w:r>
-        <w:t xml:space="preserve">) architecture to color in the black and white pages of a comic  </w:t>
+        <w:t xml:space="preserve">Implemented, with partner, Conditional Generative Adversarial Network (cGAN) architecture to color in the black and white pages of a comic  </w:t>
       </w:r>
     </w:p>
     <w:p>
@@ -816,15 +840,7 @@
         <w:spacing w:after="0"/>
       </w:pPr>
       <w:r>
-        <w:t xml:space="preserve">Utilized </w:t>
-      </w:r>
-      <w:proofErr w:type="spellStart"/>
-      <w:r>
-        <w:t>screentone</w:t>
-      </w:r>
-      <w:proofErr w:type="spellEnd"/>
-      <w:r>
-        <w:t xml:space="preserve"> removal and image segmentation to clean original black and white images and prepare them for colorization while preserving important features  </w:t>
+        <w:t xml:space="preserve">Utilized screentone removal and image segmentation to clean original black and white images and prepare them for colorization while preserving important features  </w:t>
       </w:r>
     </w:p>
     <w:p>

</xml_diff>

<commit_message>
removed honors from resume i guess
</commit_message>
<xml_diff>
--- a/bdepst-resume-2021.docx
+++ b/bdepst-resume-2021.docx
@@ -61,12 +61,14 @@
         <w:t xml:space="preserve">| </w:t>
       </w:r>
       <w:hyperlink r:id="rId5" w:history="1">
+        <w:proofErr w:type="spellStart"/>
         <w:r>
           <w:rPr>
             <w:rStyle w:val="Hyperlink"/>
           </w:rPr>
           <w:t>bribri.dev</w:t>
         </w:r>
+        <w:proofErr w:type="spellEnd"/>
       </w:hyperlink>
     </w:p>
     <w:p>
@@ -228,6 +230,7 @@
       <w:r>
         <w:t xml:space="preserve"> </w:t>
       </w:r>
+      <w:proofErr w:type="gramStart"/>
       <w:r>
         <w:tab/>
       </w:r>
@@ -236,6 +239,9 @@
       </w:r>
       <w:r>
         <w:tab/>
+      </w:r>
+      <w:proofErr w:type="gramEnd"/>
+      <w:r>
         <w:t xml:space="preserve">  </w:t>
       </w:r>
       <w:r>
@@ -308,13 +314,11 @@
         </w:numPr>
         <w:spacing w:after="0"/>
         <w:rPr>
-          <w:sz w:val="20"/>
           <w:szCs w:val="21"/>
         </w:rPr>
       </w:pPr>
       <w:r>
         <w:rPr>
-          <w:sz w:val="20"/>
           <w:szCs w:val="21"/>
         </w:rPr>
         <w:t xml:space="preserve">Relevant Coursework: Computer Organization, Computer Security, Web Systems, Foundations of </w:t>
@@ -325,13 +329,11 @@
         <w:spacing w:after="0"/>
         <w:ind w:left="720" w:firstLine="0"/>
         <w:rPr>
-          <w:sz w:val="20"/>
           <w:szCs w:val="21"/>
         </w:rPr>
       </w:pPr>
       <w:r>
         <w:rPr>
-          <w:sz w:val="20"/>
           <w:szCs w:val="21"/>
         </w:rPr>
         <w:t xml:space="preserve">Computer Science, Computer Vision, Software Engineering, Computer Game Design and Development, Machine Learning </w:t>
@@ -345,16 +347,14 @@
         </w:numPr>
         <w:spacing w:after="0"/>
         <w:rPr>
-          <w:sz w:val="20"/>
           <w:szCs w:val="21"/>
         </w:rPr>
       </w:pPr>
       <w:r>
         <w:rPr>
-          <w:sz w:val="20"/>
           <w:szCs w:val="21"/>
         </w:rPr>
-        <w:t xml:space="preserve">Dean’s Honor List: Fall 2017, Spring 2018, Fall 2018 and University Honors: Fall 2018, Winter 2020  </w:t>
+        <w:t>Instructional Aide for Computer Game Design and Development: Fall 2021</w:t>
       </w:r>
     </w:p>
     <w:p>
@@ -365,31 +365,28 @@
         </w:numPr>
         <w:spacing w:after="0"/>
         <w:rPr>
-          <w:sz w:val="20"/>
           <w:szCs w:val="21"/>
         </w:rPr>
       </w:pPr>
       <w:r>
         <w:rPr>
-          <w:sz w:val="20"/>
           <w:szCs w:val="21"/>
         </w:rPr>
-        <w:t>Instructional Aide for Computer Game Design and Development: Fall 2021</w:t>
-      </w:r>
-    </w:p>
-    <w:p>
-      <w:pPr>
-        <w:numPr>
-          <w:ilvl w:val="0"/>
-          <w:numId w:val="1"/>
-        </w:numPr>
-        <w:spacing w:after="0"/>
-      </w:pPr>
-      <w:r>
-        <w:t>President of Animania: T</w:t>
-      </w:r>
-      <w:r>
-        <w:t>he Japanese Animation Film Society</w:t>
+        <w:t xml:space="preserve">President of </w:t>
+      </w:r>
+      <w:proofErr w:type="spellStart"/>
+      <w:r>
+        <w:rPr>
+          <w:szCs w:val="21"/>
+        </w:rPr>
+        <w:t>Animania</w:t>
+      </w:r>
+      <w:proofErr w:type="spellEnd"/>
+      <w:r>
+        <w:rPr>
+          <w:szCs w:val="21"/>
+        </w:rPr>
+        <w:t>: The Japanese Animation Film Society</w:t>
       </w:r>
     </w:p>
     <w:p>
@@ -528,12 +525,21 @@
         <w:spacing w:after="0"/>
         <w:ind w:left="0" w:firstLine="0"/>
       </w:pPr>
+      <w:proofErr w:type="spellStart"/>
       <w:r>
         <w:rPr>
           <w:b/>
           <w:bCs/>
         </w:rPr>
-        <w:t xml:space="preserve">WolverineSoft Studio </w:t>
+        <w:t>WolverineSoft</w:t>
+      </w:r>
+      <w:proofErr w:type="spellEnd"/>
+      <w:r>
+        <w:rPr>
+          <w:b/>
+          <w:bCs/>
+        </w:rPr>
+        <w:t xml:space="preserve"> Studio </w:t>
       </w:r>
       <w:r>
         <w:rPr>
@@ -828,7 +834,15 @@
         <w:spacing w:after="0"/>
       </w:pPr>
       <w:r>
-        <w:t xml:space="preserve">Implemented, with partner, Conditional Generative Adversarial Network (cGAN) architecture to color in the black and white pages of a comic  </w:t>
+        <w:t>Implemented, with partner, Conditional Generative Adversarial Network (</w:t>
+      </w:r>
+      <w:proofErr w:type="spellStart"/>
+      <w:r>
+        <w:t>cGAN</w:t>
+      </w:r>
+      <w:proofErr w:type="spellEnd"/>
+      <w:r>
+        <w:t xml:space="preserve">) architecture to color in the black and white pages of a comic  </w:t>
       </w:r>
     </w:p>
     <w:p>
@@ -840,7 +854,15 @@
         <w:spacing w:after="0"/>
       </w:pPr>
       <w:r>
-        <w:t xml:space="preserve">Utilized screentone removal and image segmentation to clean original black and white images and prepare them for colorization while preserving important features  </w:t>
+        <w:t xml:space="preserve">Utilized </w:t>
+      </w:r>
+      <w:proofErr w:type="spellStart"/>
+      <w:r>
+        <w:t>screentone</w:t>
+      </w:r>
+      <w:proofErr w:type="spellEnd"/>
+      <w:r>
+        <w:t xml:space="preserve"> removal and image segmentation to clean original black and white images and prepare them for colorization while preserving important features  </w:t>
       </w:r>
     </w:p>
     <w:p>

</xml_diff>

<commit_message>
Revert "removed honors from resume i guess"
This reverts commit 09f727b91ffdf50c8a56e9b90c85480e114c465a.
</commit_message>
<xml_diff>
--- a/bdepst-resume-2021.docx
+++ b/bdepst-resume-2021.docx
@@ -61,14 +61,12 @@
         <w:t xml:space="preserve">| </w:t>
       </w:r>
       <w:hyperlink r:id="rId5" w:history="1">
-        <w:proofErr w:type="spellStart"/>
         <w:r>
           <w:rPr>
             <w:rStyle w:val="Hyperlink"/>
           </w:rPr>
           <w:t>bribri.dev</w:t>
         </w:r>
-        <w:proofErr w:type="spellEnd"/>
       </w:hyperlink>
     </w:p>
     <w:p>
@@ -230,7 +228,6 @@
       <w:r>
         <w:t xml:space="preserve"> </w:t>
       </w:r>
-      <w:proofErr w:type="gramStart"/>
       <w:r>
         <w:tab/>
       </w:r>
@@ -239,9 +236,6 @@
       </w:r>
       <w:r>
         <w:tab/>
-      </w:r>
-      <w:proofErr w:type="gramEnd"/>
-      <w:r>
         <w:t xml:space="preserve">  </w:t>
       </w:r>
       <w:r>
@@ -314,11 +308,13 @@
         </w:numPr>
         <w:spacing w:after="0"/>
         <w:rPr>
+          <w:sz w:val="20"/>
           <w:szCs w:val="21"/>
         </w:rPr>
       </w:pPr>
       <w:r>
         <w:rPr>
+          <w:sz w:val="20"/>
           <w:szCs w:val="21"/>
         </w:rPr>
         <w:t xml:space="preserve">Relevant Coursework: Computer Organization, Computer Security, Web Systems, Foundations of </w:t>
@@ -329,11 +325,13 @@
         <w:spacing w:after="0"/>
         <w:ind w:left="720" w:firstLine="0"/>
         <w:rPr>
+          <w:sz w:val="20"/>
           <w:szCs w:val="21"/>
         </w:rPr>
       </w:pPr>
       <w:r>
         <w:rPr>
+          <w:sz w:val="20"/>
           <w:szCs w:val="21"/>
         </w:rPr>
         <w:t xml:space="preserve">Computer Science, Computer Vision, Software Engineering, Computer Game Design and Development, Machine Learning </w:t>
@@ -347,14 +345,16 @@
         </w:numPr>
         <w:spacing w:after="0"/>
         <w:rPr>
+          <w:sz w:val="20"/>
           <w:szCs w:val="21"/>
         </w:rPr>
       </w:pPr>
       <w:r>
         <w:rPr>
+          <w:sz w:val="20"/>
           <w:szCs w:val="21"/>
         </w:rPr>
-        <w:t>Instructional Aide for Computer Game Design and Development: Fall 2021</w:t>
+        <w:t xml:space="preserve">Dean’s Honor List: Fall 2017, Spring 2018, Fall 2018 and University Honors: Fall 2018, Winter 2020  </w:t>
       </w:r>
     </w:p>
     <w:p>
@@ -365,28 +365,31 @@
         </w:numPr>
         <w:spacing w:after="0"/>
         <w:rPr>
+          <w:sz w:val="20"/>
           <w:szCs w:val="21"/>
         </w:rPr>
       </w:pPr>
       <w:r>
         <w:rPr>
+          <w:sz w:val="20"/>
           <w:szCs w:val="21"/>
         </w:rPr>
-        <w:t xml:space="preserve">President of </w:t>
-      </w:r>
-      <w:proofErr w:type="spellStart"/>
-      <w:r>
-        <w:rPr>
-          <w:szCs w:val="21"/>
-        </w:rPr>
-        <w:t>Animania</w:t>
-      </w:r>
-      <w:proofErr w:type="spellEnd"/>
-      <w:r>
-        <w:rPr>
-          <w:szCs w:val="21"/>
-        </w:rPr>
-        <w:t>: The Japanese Animation Film Society</w:t>
+        <w:t>Instructional Aide for Computer Game Design and Development: Fall 2021</w:t>
+      </w:r>
+    </w:p>
+    <w:p>
+      <w:pPr>
+        <w:numPr>
+          <w:ilvl w:val="0"/>
+          <w:numId w:val="1"/>
+        </w:numPr>
+        <w:spacing w:after="0"/>
+      </w:pPr>
+      <w:r>
+        <w:t>President of Animania: T</w:t>
+      </w:r>
+      <w:r>
+        <w:t>he Japanese Animation Film Society</w:t>
       </w:r>
     </w:p>
     <w:p>
@@ -525,21 +528,12 @@
         <w:spacing w:after="0"/>
         <w:ind w:left="0" w:firstLine="0"/>
       </w:pPr>
-      <w:proofErr w:type="spellStart"/>
       <w:r>
         <w:rPr>
           <w:b/>
           <w:bCs/>
         </w:rPr>
-        <w:t>WolverineSoft</w:t>
-      </w:r>
-      <w:proofErr w:type="spellEnd"/>
-      <w:r>
-        <w:rPr>
-          <w:b/>
-          <w:bCs/>
-        </w:rPr>
-        <w:t xml:space="preserve"> Studio </w:t>
+        <w:t xml:space="preserve">WolverineSoft Studio </w:t>
       </w:r>
       <w:r>
         <w:rPr>
@@ -834,15 +828,7 @@
         <w:spacing w:after="0"/>
       </w:pPr>
       <w:r>
-        <w:t>Implemented, with partner, Conditional Generative Adversarial Network (</w:t>
-      </w:r>
-      <w:proofErr w:type="spellStart"/>
-      <w:r>
-        <w:t>cGAN</w:t>
-      </w:r>
-      <w:proofErr w:type="spellEnd"/>
-      <w:r>
-        <w:t xml:space="preserve">) architecture to color in the black and white pages of a comic  </w:t>
+        <w:t xml:space="preserve">Implemented, with partner, Conditional Generative Adversarial Network (cGAN) architecture to color in the black and white pages of a comic  </w:t>
       </w:r>
     </w:p>
     <w:p>
@@ -854,15 +840,7 @@
         <w:spacing w:after="0"/>
       </w:pPr>
       <w:r>
-        <w:t xml:space="preserve">Utilized </w:t>
-      </w:r>
-      <w:proofErr w:type="spellStart"/>
-      <w:r>
-        <w:t>screentone</w:t>
-      </w:r>
-      <w:proofErr w:type="spellEnd"/>
-      <w:r>
-        <w:t xml:space="preserve"> removal and image segmentation to clean original black and white images and prepare them for colorization while preserving important features  </w:t>
+        <w:t xml:space="preserve">Utilized screentone removal and image segmentation to clean original black and white images and prepare them for colorization while preserving important features  </w:t>
       </w:r>
     </w:p>
     <w:p>

</xml_diff>

<commit_message>
updated resume w/ honors
</commit_message>
<xml_diff>
--- a/bdepst-resume-2021.docx
+++ b/bdepst-resume-2021.docx
@@ -354,7 +354,105 @@
           <w:sz w:val="20"/>
           <w:szCs w:val="21"/>
         </w:rPr>
-        <w:t xml:space="preserve">Dean’s Honor List: Fall 2017, Spring 2018, Fall 2018 and University Honors: Fall 2018, Winter 2020  </w:t>
+        <w:t xml:space="preserve">Dean’s Honor List: Fall </w:t>
+      </w:r>
+      <w:r>
+        <w:rPr>
+          <w:sz w:val="20"/>
+          <w:szCs w:val="21"/>
+        </w:rPr>
+        <w:t>‘</w:t>
+      </w:r>
+      <w:r>
+        <w:rPr>
+          <w:sz w:val="20"/>
+          <w:szCs w:val="21"/>
+        </w:rPr>
+        <w:t xml:space="preserve">17, Spring </w:t>
+      </w:r>
+      <w:r>
+        <w:rPr>
+          <w:sz w:val="20"/>
+          <w:szCs w:val="21"/>
+        </w:rPr>
+        <w:t>‘</w:t>
+      </w:r>
+      <w:r>
+        <w:rPr>
+          <w:sz w:val="20"/>
+          <w:szCs w:val="21"/>
+        </w:rPr>
+        <w:t xml:space="preserve">18, Fall </w:t>
+      </w:r>
+      <w:r>
+        <w:rPr>
+          <w:sz w:val="20"/>
+          <w:szCs w:val="21"/>
+        </w:rPr>
+        <w:t>‘</w:t>
+      </w:r>
+      <w:r>
+        <w:rPr>
+          <w:sz w:val="20"/>
+          <w:szCs w:val="21"/>
+        </w:rPr>
+        <w:t xml:space="preserve">18 </w:t>
+      </w:r>
+      <w:r>
+        <w:rPr>
+          <w:sz w:val="20"/>
+          <w:szCs w:val="21"/>
+        </w:rPr>
+        <w:t>|</w:t>
+      </w:r>
+      <w:r>
+        <w:rPr>
+          <w:sz w:val="20"/>
+          <w:szCs w:val="21"/>
+        </w:rPr>
+        <w:t xml:space="preserve"> University Honors: Fall </w:t>
+      </w:r>
+      <w:r>
+        <w:rPr>
+          <w:sz w:val="20"/>
+          <w:szCs w:val="21"/>
+        </w:rPr>
+        <w:t>‘</w:t>
+      </w:r>
+      <w:r>
+        <w:rPr>
+          <w:sz w:val="20"/>
+          <w:szCs w:val="21"/>
+        </w:rPr>
+        <w:t xml:space="preserve">18, Winter </w:t>
+      </w:r>
+      <w:r>
+        <w:rPr>
+          <w:sz w:val="20"/>
+          <w:szCs w:val="21"/>
+        </w:rPr>
+        <w:t>‘</w:t>
+      </w:r>
+      <w:r>
+        <w:rPr>
+          <w:sz w:val="20"/>
+          <w:szCs w:val="21"/>
+        </w:rPr>
+        <w:t>20</w:t>
+      </w:r>
+      <w:r>
+        <w:rPr>
+          <w:sz w:val="20"/>
+          <w:szCs w:val="21"/>
+        </w:rPr>
+        <w:t>, Fall ‘21</w:t>
+      </w:r>
+      <w:r>
+        <w:rPr>
+          <w:sz w:val="20"/>
+          <w:szCs w:val="21"/>
+        </w:rPr>
+        <w:t xml:space="preserve">  </w:t>
       </w:r>
     </w:p>
     <w:p>

</xml_diff>

<commit_message>
updated resume to be 2022
</commit_message>
<xml_diff>
--- a/bdepst-resume-2021.docx
+++ b/bdepst-resume-2021.docx
@@ -1,6 +1,6 @@
 
 <file path=word/document.xml><?xml version="1.0" encoding="utf-8"?>
-<w:document xmlns:wpc="http://schemas.microsoft.com/office/word/2010/wordprocessingCanvas" xmlns:cx="http://schemas.microsoft.com/office/drawing/2014/chartex" xmlns:cx1="http://schemas.microsoft.com/office/drawing/2015/9/8/chartex" xmlns:cx2="http://schemas.microsoft.com/office/drawing/2015/10/21/chartex" xmlns:cx3="http://schemas.microsoft.com/office/drawing/2016/5/9/chartex" xmlns:cx4="http://schemas.microsoft.com/office/drawing/2016/5/10/chartex" xmlns:cx5="http://schemas.microsoft.com/office/drawing/2016/5/11/chartex" xmlns:cx6="http://schemas.microsoft.com/office/drawing/2016/5/12/chartex" xmlns:cx7="http://schemas.microsoft.com/office/drawing/2016/5/13/chartex" xmlns:cx8="http://schemas.microsoft.com/office/drawing/2016/5/14/chartex" xmlns:mc="http://schemas.openxmlformats.org/markup-compatibility/2006" xmlns:aink="http://schemas.microsoft.com/office/drawing/2016/ink" xmlns:am3d="http://schemas.microsoft.com/office/drawing/2017/model3d" xmlns:o="urn:schemas-microsoft-com:office:office" xmlns:r="http://schemas.openxmlformats.org/officeDocument/2006/relationships" xmlns:m="http://schemas.openxmlformats.org/officeDocument/2006/math" xmlns:v="urn:schemas-microsoft-com:vml" xmlns:wp14="http://schemas.microsoft.com/office/word/2010/wordprocessingDrawing" xmlns:wp="http://schemas.openxmlformats.org/drawingml/2006/wordprocessingDrawing" xmlns:w10="urn:schemas-microsoft-com:office:word" xmlns:w="http://schemas.openxmlformats.org/wordprocessingml/2006/main" xmlns:w14="http://schemas.microsoft.com/office/word/2010/wordml" xmlns:w15="http://schemas.microsoft.com/office/word/2012/wordml" xmlns:w16cex="http://schemas.microsoft.com/office/word/2018/wordml/cex" xmlns:w16cid="http://schemas.microsoft.com/office/word/2016/wordml/cid" xmlns:w16="http://schemas.microsoft.com/office/word/2018/wordml" xmlns:w16sdtdh="http://schemas.microsoft.com/office/word/2020/wordml/sdtdatahash" xmlns:w16se="http://schemas.microsoft.com/office/word/2015/wordml/symex" xmlns:wpg="http://schemas.microsoft.com/office/word/2010/wordprocessingGroup" xmlns:wpi="http://schemas.microsoft.com/office/word/2010/wordprocessingInk" xmlns:wne="http://schemas.microsoft.com/office/word/2006/wordml" xmlns:wps="http://schemas.microsoft.com/office/word/2010/wordprocessingShape" mc:Ignorable="w14 w15 w16se w16cid w16 w16cex w16sdtdh wp14">
+<w:document xmlns:wpc="http://schemas.microsoft.com/office/word/2010/wordprocessingCanvas" xmlns:cx="http://schemas.microsoft.com/office/drawing/2014/chartex" xmlns:cx1="http://schemas.microsoft.com/office/drawing/2015/9/8/chartex" xmlns:cx2="http://schemas.microsoft.com/office/drawing/2015/10/21/chartex" xmlns:cx3="http://schemas.microsoft.com/office/drawing/2016/5/9/chartex" xmlns:cx4="http://schemas.microsoft.com/office/drawing/2016/5/10/chartex" xmlns:cx5="http://schemas.microsoft.com/office/drawing/2016/5/11/chartex" xmlns:cx6="http://schemas.microsoft.com/office/drawing/2016/5/12/chartex" xmlns:cx7="http://schemas.microsoft.com/office/drawing/2016/5/13/chartex" xmlns:cx8="http://schemas.microsoft.com/office/drawing/2016/5/14/chartex" xmlns:mc="http://schemas.openxmlformats.org/markup-compatibility/2006" xmlns:aink="http://schemas.microsoft.com/office/drawing/2016/ink" xmlns:am3d="http://schemas.microsoft.com/office/drawing/2017/model3d" xmlns:o="urn:schemas-microsoft-com:office:office" xmlns:oel="http://schemas.microsoft.com/office/2019/extlst" xmlns:r="http://schemas.openxmlformats.org/officeDocument/2006/relationships" xmlns:m="http://schemas.openxmlformats.org/officeDocument/2006/math" xmlns:v="urn:schemas-microsoft-com:vml" xmlns:wp14="http://schemas.microsoft.com/office/word/2010/wordprocessingDrawing" xmlns:wp="http://schemas.openxmlformats.org/drawingml/2006/wordprocessingDrawing" xmlns:w10="urn:schemas-microsoft-com:office:word" xmlns:w="http://schemas.openxmlformats.org/wordprocessingml/2006/main" xmlns:w14="http://schemas.microsoft.com/office/word/2010/wordml" xmlns:w15="http://schemas.microsoft.com/office/word/2012/wordml" xmlns:w16cex="http://schemas.microsoft.com/office/word/2018/wordml/cex" xmlns:w16cid="http://schemas.microsoft.com/office/word/2016/wordml/cid" xmlns:w16="http://schemas.microsoft.com/office/word/2018/wordml" xmlns:w16sdtdh="http://schemas.microsoft.com/office/word/2020/wordml/sdtdatahash" xmlns:w16se="http://schemas.microsoft.com/office/word/2015/wordml/symex" xmlns:wpg="http://schemas.microsoft.com/office/word/2010/wordprocessingGroup" xmlns:wpi="http://schemas.microsoft.com/office/word/2010/wordprocessingInk" xmlns:wne="http://schemas.microsoft.com/office/word/2006/wordml" xmlns:wps="http://schemas.microsoft.com/office/word/2010/wordprocessingShape" mc:Ignorable="w14 w15 w16se w16cid w16 w16cex w16sdtdh wp14">
   <w:body>
     <w:p>
       <w:pPr>
@@ -61,14 +61,12 @@
         <w:t xml:space="preserve">| </w:t>
       </w:r>
       <w:hyperlink r:id="rId5" w:history="1">
-        <w:proofErr w:type="spellStart"/>
         <w:r>
           <w:rPr>
             <w:rStyle w:val="Hyperlink"/>
           </w:rPr>
           <w:t>bribri.dev</w:t>
         </w:r>
-        <w:proofErr w:type="spellEnd"/>
       </w:hyperlink>
     </w:p>
     <w:p>
@@ -242,7 +240,6 @@
         </w:rPr>
         <w:t xml:space="preserve"> </w:t>
       </w:r>
-      <w:proofErr w:type="gramStart"/>
       <w:r>
         <w:rPr>
           <w:sz w:val="22"/>
@@ -263,13 +260,6 @@
           <w:szCs w:val="24"/>
         </w:rPr>
         <w:tab/>
-      </w:r>
-      <w:proofErr w:type="gramEnd"/>
-      <w:r>
-        <w:rPr>
-          <w:sz w:val="22"/>
-          <w:szCs w:val="24"/>
-        </w:rPr>
         <w:t xml:space="preserve">  </w:t>
       </w:r>
       <w:r>
@@ -499,21 +489,7 @@
         <w:rPr>
           <w:szCs w:val="21"/>
         </w:rPr>
-        <w:t xml:space="preserve">President of </w:t>
-      </w:r>
-      <w:proofErr w:type="spellStart"/>
-      <w:r>
-        <w:rPr>
-          <w:szCs w:val="21"/>
-        </w:rPr>
-        <w:t>Animania</w:t>
-      </w:r>
-      <w:proofErr w:type="spellEnd"/>
-      <w:r>
-        <w:rPr>
-          <w:szCs w:val="21"/>
-        </w:rPr>
-        <w:t>: The Japanese Animation Film Society</w:t>
+        <w:t>President of Animania: The Japanese Animation Film Society</w:t>
       </w:r>
     </w:p>
     <w:p>
@@ -652,21 +628,12 @@
         <w:spacing w:after="0"/>
         <w:ind w:left="0" w:firstLine="0"/>
       </w:pPr>
-      <w:proofErr w:type="spellStart"/>
       <w:r>
         <w:rPr>
           <w:b/>
           <w:bCs/>
         </w:rPr>
-        <w:t>WolverineSoft</w:t>
-      </w:r>
-      <w:proofErr w:type="spellEnd"/>
-      <w:r>
-        <w:rPr>
-          <w:b/>
-          <w:bCs/>
-        </w:rPr>
-        <w:t xml:space="preserve"> Studio </w:t>
+        <w:t xml:space="preserve">WolverineSoft Studio </w:t>
       </w:r>
       <w:r>
         <w:rPr>
@@ -847,10 +814,13 @@
           <w:b/>
           <w:bCs/>
         </w:rPr>
-        <w:t xml:space="preserve">           </w:t>
-      </w:r>
-      <w:r>
-        <w:t>May 2020 – Present</w:t>
+        <w:t xml:space="preserve">      </w:t>
+      </w:r>
+      <w:r>
+        <w:t xml:space="preserve">May 2020 – </w:t>
+      </w:r>
+      <w:r>
+        <w:t>April 2022</w:t>
       </w:r>
     </w:p>
     <w:p>
@@ -984,15 +954,7 @@
         <w:spacing w:after="0"/>
       </w:pPr>
       <w:r>
-        <w:t>Implemented, with partner, Conditional Generative Adversarial Network (</w:t>
-      </w:r>
-      <w:proofErr w:type="spellStart"/>
-      <w:r>
-        <w:t>cGAN</w:t>
-      </w:r>
-      <w:proofErr w:type="spellEnd"/>
-      <w:r>
-        <w:t xml:space="preserve">) architecture to color in the black and white pages of a comic  </w:t>
+        <w:t xml:space="preserve">Implemented, with partner, Conditional Generative Adversarial Network (cGAN) architecture to color in the black and white pages of a comic  </w:t>
       </w:r>
     </w:p>
     <w:p>
@@ -1004,15 +966,7 @@
         <w:spacing w:after="0"/>
       </w:pPr>
       <w:r>
-        <w:t xml:space="preserve">Utilized </w:t>
-      </w:r>
-      <w:proofErr w:type="spellStart"/>
-      <w:r>
-        <w:t>screentone</w:t>
-      </w:r>
-      <w:proofErr w:type="spellEnd"/>
-      <w:r>
-        <w:t xml:space="preserve"> removal and image segmentation to clean original black and white images and prepare them for colorization while preserving important features  </w:t>
+        <w:t xml:space="preserve">Utilized screentone removal and image segmentation to clean original black and white images and prepare them for colorization while preserving important features  </w:t>
       </w:r>
     </w:p>
     <w:p>
@@ -1251,7 +1205,7 @@
 </file>
 
 <file path=word/numbering.xml><?xml version="1.0" encoding="utf-8"?>
-<w:numbering xmlns:wpc="http://schemas.microsoft.com/office/word/2010/wordprocessingCanvas" xmlns:cx="http://schemas.microsoft.com/office/drawing/2014/chartex" xmlns:cx1="http://schemas.microsoft.com/office/drawing/2015/9/8/chartex" xmlns:cx2="http://schemas.microsoft.com/office/drawing/2015/10/21/chartex" xmlns:cx3="http://schemas.microsoft.com/office/drawing/2016/5/9/chartex" xmlns:cx4="http://schemas.microsoft.com/office/drawing/2016/5/10/chartex" xmlns:cx5="http://schemas.microsoft.com/office/drawing/2016/5/11/chartex" xmlns:cx6="http://schemas.microsoft.com/office/drawing/2016/5/12/chartex" xmlns:cx7="http://schemas.microsoft.com/office/drawing/2016/5/13/chartex" xmlns:cx8="http://schemas.microsoft.com/office/drawing/2016/5/14/chartex" xmlns:mc="http://schemas.openxmlformats.org/markup-compatibility/2006" xmlns:aink="http://schemas.microsoft.com/office/drawing/2016/ink" xmlns:am3d="http://schemas.microsoft.com/office/drawing/2017/model3d" xmlns:o="urn:schemas-microsoft-com:office:office" xmlns:r="http://schemas.openxmlformats.org/officeDocument/2006/relationships" xmlns:m="http://schemas.openxmlformats.org/officeDocument/2006/math" xmlns:v="urn:schemas-microsoft-com:vml" xmlns:wp14="http://schemas.microsoft.com/office/word/2010/wordprocessingDrawing" xmlns:wp="http://schemas.openxmlformats.org/drawingml/2006/wordprocessingDrawing" xmlns:w10="urn:schemas-microsoft-com:office:word" xmlns:w="http://schemas.openxmlformats.org/wordprocessingml/2006/main" xmlns:w14="http://schemas.microsoft.com/office/word/2010/wordml" xmlns:w15="http://schemas.microsoft.com/office/word/2012/wordml" xmlns:w16cex="http://schemas.microsoft.com/office/word/2018/wordml/cex" xmlns:w16cid="http://schemas.microsoft.com/office/word/2016/wordml/cid" xmlns:w16="http://schemas.microsoft.com/office/word/2018/wordml" xmlns:w16sdtdh="http://schemas.microsoft.com/office/word/2020/wordml/sdtdatahash" xmlns:w16se="http://schemas.microsoft.com/office/word/2015/wordml/symex" xmlns:wpg="http://schemas.microsoft.com/office/word/2010/wordprocessingGroup" xmlns:wpi="http://schemas.microsoft.com/office/word/2010/wordprocessingInk" xmlns:wne="http://schemas.microsoft.com/office/word/2006/wordml" xmlns:wps="http://schemas.microsoft.com/office/word/2010/wordprocessingShape" mc:Ignorable="w14 w15 w16se w16cid w16 w16cex w16sdtdh wp14">
+<w:numbering xmlns:wpc="http://schemas.microsoft.com/office/word/2010/wordprocessingCanvas" xmlns:cx="http://schemas.microsoft.com/office/drawing/2014/chartex" xmlns:cx1="http://schemas.microsoft.com/office/drawing/2015/9/8/chartex" xmlns:cx2="http://schemas.microsoft.com/office/drawing/2015/10/21/chartex" xmlns:cx3="http://schemas.microsoft.com/office/drawing/2016/5/9/chartex" xmlns:cx4="http://schemas.microsoft.com/office/drawing/2016/5/10/chartex" xmlns:cx5="http://schemas.microsoft.com/office/drawing/2016/5/11/chartex" xmlns:cx6="http://schemas.microsoft.com/office/drawing/2016/5/12/chartex" xmlns:cx7="http://schemas.microsoft.com/office/drawing/2016/5/13/chartex" xmlns:cx8="http://schemas.microsoft.com/office/drawing/2016/5/14/chartex" xmlns:mc="http://schemas.openxmlformats.org/markup-compatibility/2006" xmlns:aink="http://schemas.microsoft.com/office/drawing/2016/ink" xmlns:am3d="http://schemas.microsoft.com/office/drawing/2017/model3d" xmlns:o="urn:schemas-microsoft-com:office:office" xmlns:oel="http://schemas.microsoft.com/office/2019/extlst" xmlns:r="http://schemas.openxmlformats.org/officeDocument/2006/relationships" xmlns:m="http://schemas.openxmlformats.org/officeDocument/2006/math" xmlns:v="urn:schemas-microsoft-com:vml" xmlns:wp14="http://schemas.microsoft.com/office/word/2010/wordprocessingDrawing" xmlns:wp="http://schemas.openxmlformats.org/drawingml/2006/wordprocessingDrawing" xmlns:w10="urn:schemas-microsoft-com:office:word" xmlns:w="http://schemas.openxmlformats.org/wordprocessingml/2006/main" xmlns:w14="http://schemas.microsoft.com/office/word/2010/wordml" xmlns:w15="http://schemas.microsoft.com/office/word/2012/wordml" xmlns:w16cex="http://schemas.microsoft.com/office/word/2018/wordml/cex" xmlns:w16cid="http://schemas.microsoft.com/office/word/2016/wordml/cid" xmlns:w16="http://schemas.microsoft.com/office/word/2018/wordml" xmlns:w16sdtdh="http://schemas.microsoft.com/office/word/2020/wordml/sdtdatahash" xmlns:w16se="http://schemas.microsoft.com/office/word/2015/wordml/symex" xmlns:wpg="http://schemas.microsoft.com/office/word/2010/wordprocessingGroup" xmlns:wpi="http://schemas.microsoft.com/office/word/2010/wordprocessingInk" xmlns:wne="http://schemas.microsoft.com/office/word/2006/wordml" xmlns:wps="http://schemas.microsoft.com/office/word/2010/wordprocessingShape" mc:Ignorable="w14 w15 w16se w16cid w16 w16cex w16sdtdh wp14">
   <w:abstractNum w:abstractNumId="0" w15:restartNumberingAfterBreak="0">
     <w:nsid w:val="0DD564BB"/>
     <w:multiLevelType w:val="hybridMultilevel"/>

</xml_diff>